<commit_message>
chore: align with Lake Protocol v8.1.5
</commit_message>
<xml_diff>
--- a/docs/vaults/u1-aa-01-applied-econometrics/ape2-crisis-iess/analysis_erick_condoy/reports/unit_root_tests.docx
+++ b/docs/vaults/u1-aa-01-applied-econometrics/ape2-crisis-iess/analysis_erick_condoy/reports/unit_root_tests.docx
@@ -187,7 +187,7 @@
           </w:tcPr>
           <w:p>
             <w:r>
-              <w:t>-1.196</w:t>
+              <w:t>-1.529</w:t>
             </w:r>
           </w:p>
         </w:tc>
@@ -197,7 +197,7 @@
           </w:tcPr>
           <w:p>
             <w:r>
-              <w:t>-0.568</w:t>
+              <w:t>-1.367</w:t>
             </w:r>
           </w:p>
         </w:tc>
@@ -207,7 +207,149 @@
           </w:tcPr>
           <w:p>
             <w:r>
-              <w:t>-5.159**</w:t>
+              <w:t>-2.707</w:t>
+            </w:r>
+          </w:p>
+        </w:tc>
+        <w:tc>
+          <w:tcPr>
+            <w:tcW w:type="dxa" w:w="864"/>
+          </w:tcPr>
+          <w:p>
+            <w:r>
+              <w:t>2010</w:t>
+            </w:r>
+          </w:p>
+        </w:tc>
+        <w:tc>
+          <w:tcPr>
+            <w:tcW w:type="dxa" w:w="864"/>
+          </w:tcPr>
+          <w:p>
+            <w:r>
+              <w:t>-1.936</w:t>
+            </w:r>
+          </w:p>
+        </w:tc>
+        <w:tc>
+          <w:tcPr>
+            <w:tcW w:type="dxa" w:w="864"/>
+          </w:tcPr>
+          <w:p>
+            <w:r>
+              <w:t>-2.963</w:t>
+            </w:r>
+          </w:p>
+        </w:tc>
+        <w:tc>
+          <w:tcPr>
+            <w:tcW w:type="dxa" w:w="864"/>
+          </w:tcPr>
+          <w:p>
+            <w:r>
+              <w:t>-4.578</w:t>
+            </w:r>
+          </w:p>
+        </w:tc>
+        <w:tc>
+          <w:tcPr>
+            <w:tcW w:type="dxa" w:w="864"/>
+          </w:tcPr>
+          <w:p>
+            <w:r>
+              <w:t>2008</w:t>
+            </w:r>
+          </w:p>
+        </w:tc>
+        <w:tc>
+          <w:tcPr>
+            <w:tcW w:type="dxa" w:w="864"/>
+          </w:tcPr>
+          <w:p>
+            <w:r>
+              <w:t>I(1)</w:t>
+            </w:r>
+          </w:p>
+        </w:tc>
+      </w:tr>
+      <w:tr>
+        <w:tc>
+          <w:tcPr>
+            <w:tcW w:type="dxa" w:w="864"/>
+          </w:tcPr>
+          <w:p>
+            <w:r>
+              <w:t>GM</w:t>
+            </w:r>
+          </w:p>
+        </w:tc>
+        <w:tc>
+          <w:tcPr>
+            <w:tcW w:type="dxa" w:w="864"/>
+          </w:tcPr>
+          <w:p>
+            <w:r>
+              <w:t>-0.863</w:t>
+            </w:r>
+          </w:p>
+        </w:tc>
+        <w:tc>
+          <w:tcPr>
+            <w:tcW w:type="dxa" w:w="864"/>
+          </w:tcPr>
+          <w:p>
+            <w:r>
+              <w:t>-1.566</w:t>
+            </w:r>
+          </w:p>
+        </w:tc>
+        <w:tc>
+          <w:tcPr>
+            <w:tcW w:type="dxa" w:w="864"/>
+          </w:tcPr>
+          <w:p>
+            <w:r>
+              <w:t>-4.458</w:t>
+            </w:r>
+          </w:p>
+        </w:tc>
+        <w:tc>
+          <w:tcPr>
+            <w:tcW w:type="dxa" w:w="864"/>
+          </w:tcPr>
+          <w:p>
+            <w:r>
+              <w:t>2008</w:t>
+            </w:r>
+          </w:p>
+        </w:tc>
+        <w:tc>
+          <w:tcPr>
+            <w:tcW w:type="dxa" w:w="864"/>
+          </w:tcPr>
+          <w:p>
+            <w:r>
+              <w:t>-3.817*</w:t>
+            </w:r>
+          </w:p>
+        </w:tc>
+        <w:tc>
+          <w:tcPr>
+            <w:tcW w:type="dxa" w:w="864"/>
+          </w:tcPr>
+          <w:p>
+            <w:r>
+              <w:t>-8.747***</w:t>
+            </w:r>
+          </w:p>
+        </w:tc>
+        <w:tc>
+          <w:tcPr>
+            <w:tcW w:type="dxa" w:w="864"/>
+          </w:tcPr>
+          <w:p>
+            <w:r>
+              <w:t>-10.371***</w:t>
             </w:r>
           </w:p>
         </w:tc>
@@ -227,7 +369,19 @@
           </w:tcPr>
           <w:p>
             <w:r>
-              <w:t>-1.460</w:t>
+              <w:t>I(1)</w:t>
+            </w:r>
+          </w:p>
+        </w:tc>
+      </w:tr>
+      <w:tr>
+        <w:tc>
+          <w:tcPr>
+            <w:tcW w:type="dxa" w:w="864"/>
+          </w:tcPr>
+          <w:p>
+            <w:r>
+              <w:t>MI</w:t>
             </w:r>
           </w:p>
         </w:tc>
@@ -237,7 +391,7 @@
           </w:tcPr>
           <w:p>
             <w:r>
-              <w:t>-1.755</w:t>
+              <w:t>-3.269</w:t>
             </w:r>
           </w:p>
         </w:tc>
@@ -247,7 +401,7 @@
           </w:tcPr>
           <w:p>
             <w:r>
-              <w:t>-4.771</w:t>
+              <w:t>-2.220</w:t>
             </w:r>
           </w:p>
         </w:tc>
@@ -257,7 +411,159 @@
           </w:tcPr>
           <w:p>
             <w:r>
-              <w:t>2013</w:t>
+              <w:t>-5.665***</w:t>
+            </w:r>
+          </w:p>
+        </w:tc>
+        <w:tc>
+          <w:tcPr>
+            <w:tcW w:type="dxa" w:w="864"/>
+          </w:tcPr>
+          <w:p>
+            <w:r>
+              <w:t>2016</w:t>
+            </w:r>
+          </w:p>
+        </w:tc>
+        <w:tc>
+          <w:tcPr>
+            <w:tcW w:type="dxa" w:w="864"/>
+          </w:tcPr>
+          <w:p>
+            <w:r>
+              <w:t>-4.347**</w:t>
+            </w:r>
+          </w:p>
+        </w:tc>
+        <w:tc>
+          <w:tcPr>
+            <w:tcW w:type="dxa" w:w="864"/>
+          </w:tcPr>
+          <w:p>
+            <w:r>
+              <w:t>-3.544*</w:t>
+            </w:r>
+          </w:p>
+        </w:tc>
+        <w:tc>
+          <w:tcPr>
+            <w:tcW w:type="dxa" w:w="864"/>
+          </w:tcPr>
+          <w:p>
+            <w:r>
+              <w:t>-9.270***</w:t>
+            </w:r>
+          </w:p>
+        </w:tc>
+        <w:tc>
+          <w:tcPr>
+            <w:tcW w:type="dxa" w:w="864"/>
+          </w:tcPr>
+          <w:p>
+            <w:r>
+              <w:t>2019</w:t>
+            </w:r>
+          </w:p>
+        </w:tc>
+        <w:tc>
+          <w:tcPr>
+            <w:tcW w:type="dxa" w:w="864"/>
+          </w:tcPr>
+          <w:p>
+            <w:r>
+              <w:t>I(1)</w:t>
+            </w:r>
+          </w:p>
+        </w:tc>
+      </w:tr>
+      <w:tr>
+        <w:tc>
+          <w:tcPr>
+            <w:tcW w:type="dxa" w:w="864"/>
+          </w:tcPr>
+          <w:p>
+            <w:r>
+              <w:t>HO</w:t>
+            </w:r>
+          </w:p>
+        </w:tc>
+        <w:tc>
+          <w:tcPr>
+            <w:tcW w:type="dxa" w:w="864"/>
+          </w:tcPr>
+          <w:p>
+            <w:r>
+              <w:t>-2.264</w:t>
+            </w:r>
+          </w:p>
+        </w:tc>
+        <w:tc>
+          <w:tcPr>
+            <w:tcW w:type="dxa" w:w="864"/>
+          </w:tcPr>
+          <w:p>
+            <w:r>
+              <w:t>-1.154</w:t>
+            </w:r>
+          </w:p>
+        </w:tc>
+        <w:tc>
+          <w:tcPr>
+            <w:tcW w:type="dxa" w:w="864"/>
+          </w:tcPr>
+          <w:p>
+            <w:r>
+              <w:t>-3.791</w:t>
+            </w:r>
+          </w:p>
+        </w:tc>
+        <w:tc>
+          <w:tcPr>
+            <w:tcW w:type="dxa" w:w="864"/>
+          </w:tcPr>
+          <w:p>
+            <w:r>
+              <w:t>1998</w:t>
+            </w:r>
+          </w:p>
+        </w:tc>
+        <w:tc>
+          <w:tcPr>
+            <w:tcW w:type="dxa" w:w="864"/>
+          </w:tcPr>
+          <w:p>
+            <w:r>
+              <w:t>-2.423</w:t>
+            </w:r>
+          </w:p>
+        </w:tc>
+        <w:tc>
+          <w:tcPr>
+            <w:tcW w:type="dxa" w:w="864"/>
+          </w:tcPr>
+          <w:p>
+            <w:r>
+              <w:t>-3.128</w:t>
+            </w:r>
+          </w:p>
+        </w:tc>
+        <w:tc>
+          <w:tcPr>
+            <w:tcW w:type="dxa" w:w="864"/>
+          </w:tcPr>
+          <w:p>
+            <w:r>
+              <w:t>-4.308</w:t>
+            </w:r>
+          </w:p>
+        </w:tc>
+        <w:tc>
+          <w:tcPr>
+            <w:tcW w:type="dxa" w:w="864"/>
+          </w:tcPr>
+          <w:p>
+            <w:r>
+              <w:t>2011</w:t>
             </w:r>
           </w:p>
         </w:tc>
@@ -289,7 +595,7 @@
           </w:tcPr>
           <w:p>
             <w:r>
-              <w:t>-2.269</w:t>
+              <w:t>-2.423</w:t>
             </w:r>
           </w:p>
         </w:tc>
@@ -299,7 +605,7 @@
           </w:tcPr>
           <w:p>
             <w:r>
-              <w:t>-2.637</w:t>
+              <w:t>-2.785</w:t>
             </w:r>
           </w:p>
         </w:tc>
@@ -309,7 +615,47 @@
           </w:tcPr>
           <w:p>
             <w:r>
-              <w:t>-3.414</w:t>
+              <w:t>-3.657</w:t>
+            </w:r>
+          </w:p>
+        </w:tc>
+        <w:tc>
+          <w:tcPr>
+            <w:tcW w:type="dxa" w:w="864"/>
+          </w:tcPr>
+          <w:p>
+            <w:r>
+              <w:t>2009</w:t>
+            </w:r>
+          </w:p>
+        </w:tc>
+        <w:tc>
+          <w:tcPr>
+            <w:tcW w:type="dxa" w:w="864"/>
+          </w:tcPr>
+          <w:p>
+            <w:r>
+              <w:t>-4.212**</w:t>
+            </w:r>
+          </w:p>
+        </w:tc>
+        <w:tc>
+          <w:tcPr>
+            <w:tcW w:type="dxa" w:w="864"/>
+          </w:tcPr>
+          <w:p>
+            <w:r>
+              <w:t>-6.756***</w:t>
+            </w:r>
+          </w:p>
+        </w:tc>
+        <w:tc>
+          <w:tcPr>
+            <w:tcW w:type="dxa" w:w="864"/>
+          </w:tcPr>
+          <w:p>
+            <w:r>
+              <w:t>-7.020***</w:t>
             </w:r>
           </w:p>
         </w:tc>
@@ -320,352 +666,6 @@
           <w:p>
             <w:r>
               <w:t>2015</w:t>
-            </w:r>
-          </w:p>
-        </w:tc>
-        <w:tc>
-          <w:tcPr>
-            <w:tcW w:type="dxa" w:w="864"/>
-          </w:tcPr>
-          <w:p>
-            <w:r>
-              <w:t>-3.169</w:t>
-            </w:r>
-          </w:p>
-        </w:tc>
-        <w:tc>
-          <w:tcPr>
-            <w:tcW w:type="dxa" w:w="864"/>
-          </w:tcPr>
-          <w:p>
-            <w:r>
-              <w:t>-5.451</w:t>
-            </w:r>
-          </w:p>
-        </w:tc>
-        <w:tc>
-          <w:tcPr>
-            <w:tcW w:type="dxa" w:w="864"/>
-          </w:tcPr>
-          <w:p>
-            <w:r>
-              <w:t>-5.901***</w:t>
-            </w:r>
-          </w:p>
-        </w:tc>
-        <w:tc>
-          <w:tcPr>
-            <w:tcW w:type="dxa" w:w="864"/>
-          </w:tcPr>
-          <w:p>
-            <w:r>
-              <w:t>2012</w:t>
-            </w:r>
-          </w:p>
-        </w:tc>
-        <w:tc>
-          <w:tcPr>
-            <w:tcW w:type="dxa" w:w="864"/>
-          </w:tcPr>
-          <w:p>
-            <w:r>
-              <w:t>I(1)</w:t>
-            </w:r>
-          </w:p>
-        </w:tc>
-      </w:tr>
-      <w:tr>
-        <w:tc>
-          <w:tcPr>
-            <w:tcW w:type="dxa" w:w="864"/>
-          </w:tcPr>
-          <w:p>
-            <w:r>
-              <w:t>EM</w:t>
-            </w:r>
-          </w:p>
-        </w:tc>
-        <w:tc>
-          <w:tcPr>
-            <w:tcW w:type="dxa" w:w="864"/>
-          </w:tcPr>
-          <w:p>
-            <w:r>
-              <w:t>-2.470</w:t>
-            </w:r>
-          </w:p>
-        </w:tc>
-        <w:tc>
-          <w:tcPr>
-            <w:tcW w:type="dxa" w:w="864"/>
-          </w:tcPr>
-          <w:p>
-            <w:r>
-              <w:t>-4.815</w:t>
-            </w:r>
-          </w:p>
-        </w:tc>
-        <w:tc>
-          <w:tcPr>
-            <w:tcW w:type="dxa" w:w="864"/>
-          </w:tcPr>
-          <w:p>
-            <w:r>
-              <w:t>-5.363**</w:t>
-            </w:r>
-          </w:p>
-        </w:tc>
-        <w:tc>
-          <w:tcPr>
-            <w:tcW w:type="dxa" w:w="864"/>
-          </w:tcPr>
-          <w:p>
-            <w:r>
-              <w:t>2019</w:t>
-            </w:r>
-          </w:p>
-        </w:tc>
-        <w:tc>
-          <w:tcPr>
-            <w:tcW w:type="dxa" w:w="864"/>
-          </w:tcPr>
-          <w:p>
-            <w:r>
-              <w:t>-3.819</w:t>
-            </w:r>
-          </w:p>
-        </w:tc>
-        <w:tc>
-          <w:tcPr>
-            <w:tcW w:type="dxa" w:w="864"/>
-          </w:tcPr>
-          <w:p>
-            <w:r>
-              <w:t>-7.445</w:t>
-            </w:r>
-          </w:p>
-        </w:tc>
-        <w:tc>
-          <w:tcPr>
-            <w:tcW w:type="dxa" w:w="864"/>
-          </w:tcPr>
-          <w:p>
-            <w:r>
-              <w:t>-5.225**</w:t>
-            </w:r>
-          </w:p>
-        </w:tc>
-        <w:tc>
-          <w:tcPr>
-            <w:tcW w:type="dxa" w:w="864"/>
-          </w:tcPr>
-          <w:p>
-            <w:r>
-              <w:t>2010</w:t>
-            </w:r>
-          </w:p>
-        </w:tc>
-        <w:tc>
-          <w:tcPr>
-            <w:tcW w:type="dxa" w:w="864"/>
-          </w:tcPr>
-          <w:p>
-            <w:r>
-              <w:t>I(1)</w:t>
-            </w:r>
-          </w:p>
-        </w:tc>
-      </w:tr>
-      <w:tr>
-        <w:tc>
-          <w:tcPr>
-            <w:tcW w:type="dxa" w:w="864"/>
-          </w:tcPr>
-          <w:p>
-            <w:r>
-              <w:t>GDP</w:t>
-            </w:r>
-          </w:p>
-        </w:tc>
-        <w:tc>
-          <w:tcPr>
-            <w:tcW w:type="dxa" w:w="864"/>
-          </w:tcPr>
-          <w:p>
-            <w:r>
-              <w:t>-1.604*</w:t>
-            </w:r>
-          </w:p>
-        </w:tc>
-        <w:tc>
-          <w:tcPr>
-            <w:tcW w:type="dxa" w:w="864"/>
-          </w:tcPr>
-          <w:p>
-            <w:r>
-              <w:t>-1.599***</w:t>
-            </w:r>
-          </w:p>
-        </w:tc>
-        <w:tc>
-          <w:tcPr>
-            <w:tcW w:type="dxa" w:w="864"/>
-          </w:tcPr>
-          <w:p>
-            <w:r>
-              <w:t>-3.660</w:t>
-            </w:r>
-          </w:p>
-        </w:tc>
-        <w:tc>
-          <w:tcPr>
-            <w:tcW w:type="dxa" w:w="864"/>
-          </w:tcPr>
-          <w:p>
-            <w:r>
-              <w:t>2013</w:t>
-            </w:r>
-          </w:p>
-        </w:tc>
-        <w:tc>
-          <w:tcPr>
-            <w:tcW w:type="dxa" w:w="864"/>
-          </w:tcPr>
-          <w:p>
-            <w:r>
-              <w:t>-3.390*</w:t>
-            </w:r>
-          </w:p>
-        </w:tc>
-        <w:tc>
-          <w:tcPr>
-            <w:tcW w:type="dxa" w:w="864"/>
-          </w:tcPr>
-          <w:p>
-            <w:r>
-              <w:t>-4.544***</w:t>
-            </w:r>
-          </w:p>
-        </w:tc>
-        <w:tc>
-          <w:tcPr>
-            <w:tcW w:type="dxa" w:w="864"/>
-          </w:tcPr>
-          <w:p>
-            <w:r>
-              <w:t>-4.490</w:t>
-            </w:r>
-          </w:p>
-        </w:tc>
-        <w:tc>
-          <w:tcPr>
-            <w:tcW w:type="dxa" w:w="864"/>
-          </w:tcPr>
-          <w:p>
-            <w:r>
-              <w:t>2011</w:t>
-            </w:r>
-          </w:p>
-        </w:tc>
-        <w:tc>
-          <w:tcPr>
-            <w:tcW w:type="dxa" w:w="864"/>
-          </w:tcPr>
-          <w:p>
-            <w:r>
-              <w:t>I(1)</w:t>
-            </w:r>
-          </w:p>
-        </w:tc>
-      </w:tr>
-      <w:tr>
-        <w:tc>
-          <w:tcPr>
-            <w:tcW w:type="dxa" w:w="864"/>
-          </w:tcPr>
-          <w:p>
-            <w:r>
-              <w:t>SBU</w:t>
-            </w:r>
-          </w:p>
-        </w:tc>
-        <w:tc>
-          <w:tcPr>
-            <w:tcW w:type="dxa" w:w="864"/>
-          </w:tcPr>
-          <w:p>
-            <w:r>
-              <w:t>-0.961</w:t>
-            </w:r>
-          </w:p>
-        </w:tc>
-        <w:tc>
-          <w:tcPr>
-            <w:tcW w:type="dxa" w:w="864"/>
-          </w:tcPr>
-          <w:p>
-            <w:r>
-              <w:t>-4.038***</w:t>
-            </w:r>
-          </w:p>
-        </w:tc>
-        <w:tc>
-          <w:tcPr>
-            <w:tcW w:type="dxa" w:w="864"/>
-          </w:tcPr>
-          <w:p>
-            <w:r>
-              <w:t>-15.022***</w:t>
-            </w:r>
-          </w:p>
-        </w:tc>
-        <w:tc>
-          <w:tcPr>
-            <w:tcW w:type="dxa" w:w="864"/>
-          </w:tcPr>
-          <w:p>
-            <w:r>
-              <w:t>2014</w:t>
-            </w:r>
-          </w:p>
-        </w:tc>
-        <w:tc>
-          <w:tcPr>
-            <w:tcW w:type="dxa" w:w="864"/>
-          </w:tcPr>
-          <w:p>
-            <w:r>
-              <w:t>-2.522</w:t>
-            </w:r>
-          </w:p>
-        </w:tc>
-        <w:tc>
-          <w:tcPr>
-            <w:tcW w:type="dxa" w:w="864"/>
-          </w:tcPr>
-          <w:p>
-            <w:r>
-              <w:t>-7.455***</w:t>
-            </w:r>
-          </w:p>
-        </w:tc>
-        <w:tc>
-          <w:tcPr>
-            <w:tcW w:type="dxa" w:w="864"/>
-          </w:tcPr>
-          <w:p>
-            <w:r>
-              <w:t>-11.610***</w:t>
-            </w:r>
-          </w:p>
-        </w:tc>
-        <w:tc>
-          <w:tcPr>
-            <w:tcW w:type="dxa" w:w="864"/>
-          </w:tcPr>
-          <w:p>
-            <w:r>
-              <w:t>2020</w:t>
             </w:r>
           </w:p>
         </w:tc>

</xml_diff>